<commit_message>
Update paper export and submission package
</commit_message>
<xml_diff>
--- a/paper/scb5_zeroshot_paper.docx
+++ b/paper/scb5_zeroshot_paper.docx
@@ -216,6 +216,15 @@
       <w:pPr>
         <w:pStyle w:val="Heading1"/>
       </w:pPr>
+      <w:r>
+        <w:rPr>
+          <w:rStyle w:val="SectionNumber"/>
+        </w:rPr>
+        <w:t xml:space="preserve">1</w:t>
+      </w:r>
+      <w:r>
+        <w:tab/>
+      </w:r>
       <w:r>
         <w:t xml:space="preserve">Introduction</w:t>
       </w:r>
@@ -893,6 +902,15 @@
         <w:pStyle w:val="Heading1"/>
       </w:pPr>
       <w:r>
+        <w:rPr>
+          <w:rStyle w:val="SectionNumber"/>
+        </w:rPr>
+        <w:t xml:space="preserve">2</w:t>
+      </w:r>
+      <w:r>
+        <w:tab/>
+      </w:r>
+      <w:r>
         <w:t xml:space="preserve">Related Work</w:t>
       </w:r>
     </w:p>
@@ -901,6 +919,15 @@
       <w:pPr>
         <w:pStyle w:val="Heading2"/>
       </w:pPr>
+      <w:r>
+        <w:rPr>
+          <w:rStyle w:val="SectionNumber"/>
+        </w:rPr>
+        <w:t xml:space="preserve">2.1</w:t>
+      </w:r>
+      <w:r>
+        <w:tab/>
+      </w:r>
       <w:r>
         <w:t xml:space="preserve">Classroom Activity Recognition</w:t>
       </w:r>
@@ -944,6 +971,15 @@
         <w:pStyle w:val="Heading2"/>
       </w:pPr>
       <w:r>
+        <w:rPr>
+          <w:rStyle w:val="SectionNumber"/>
+        </w:rPr>
+        <w:t xml:space="preserve">2.2</w:t>
+      </w:r>
+      <w:r>
+        <w:tab/>
+      </w:r>
+      <w:r>
         <w:t xml:space="preserve">Vision–Language Models</w:t>
       </w:r>
     </w:p>
@@ -1033,6 +1069,15 @@
       <w:pPr>
         <w:pStyle w:val="Heading2"/>
       </w:pPr>
+      <w:r>
+        <w:rPr>
+          <w:rStyle w:val="SectionNumber"/>
+        </w:rPr>
+        <w:t xml:space="preserve">2.3</w:t>
+      </w:r>
+      <w:r>
+        <w:tab/>
+      </w:r>
       <w:r>
         <w:t xml:space="preserve">Prompt Engineering for CLIP</w:t>
       </w:r>
@@ -1133,6 +1178,15 @@
         <w:pStyle w:val="Heading1"/>
       </w:pPr>
       <w:r>
+        <w:rPr>
+          <w:rStyle w:val="SectionNumber"/>
+        </w:rPr>
+        <w:t xml:space="preserve">3</w:t>
+      </w:r>
+      <w:r>
+        <w:tab/>
+      </w:r>
+      <w:r>
         <w:t xml:space="preserve">Materials and Methods</w:t>
       </w:r>
     </w:p>
@@ -1141,6 +1195,15 @@
       <w:pPr>
         <w:pStyle w:val="Heading2"/>
       </w:pPr>
+      <w:r>
+        <w:rPr>
+          <w:rStyle w:val="SectionNumber"/>
+        </w:rPr>
+        <w:t xml:space="preserve">3.1</w:t>
+      </w:r>
+      <w:r>
+        <w:tab/>
+      </w:r>
       <w:r>
         <w:t xml:space="preserve">Multi-Scene Classroom Activity Benchmark</w:t>
       </w:r>
@@ -1602,6 +1665,15 @@
         <w:pStyle w:val="Heading4"/>
       </w:pPr>
       <w:r>
+        <w:rPr>
+          <w:rStyle w:val="SectionNumber"/>
+        </w:rPr>
+        <w:t xml:space="preserve">3.1.0.1</w:t>
+      </w:r>
+      <w:r>
+        <w:tab/>
+      </w:r>
+      <w:r>
         <w:t xml:space="preserve">TeacherBehavior.</w:t>
       </w:r>
     </w:p>
@@ -2631,6 +2703,15 @@
         <w:pStyle w:val="Heading4"/>
       </w:pPr>
       <w:r>
+        <w:rPr>
+          <w:rStyle w:val="SectionNumber"/>
+        </w:rPr>
+        <w:t xml:space="preserve">3.1.0.2</w:t>
+      </w:r>
+      <w:r>
+        <w:tab/>
+      </w:r>
+      <w:r>
         <w:t xml:space="preserve">HandriseReadWrite.</w:t>
       </w:r>
     </w:p>
@@ -2678,6 +2759,15 @@
       <w:pPr>
         <w:pStyle w:val="Heading4"/>
       </w:pPr>
+      <w:r>
+        <w:rPr>
+          <w:rStyle w:val="SectionNumber"/>
+        </w:rPr>
+        <w:t xml:space="preserve">3.1.0.3</w:t>
+      </w:r>
+      <w:r>
+        <w:tab/>
+      </w:r>
       <w:r>
         <w:t xml:space="preserve">BowTurnHead.</w:t>
       </w:r>
@@ -2835,6 +2925,15 @@
         <w:pStyle w:val="Heading2"/>
       </w:pPr>
       <w:r>
+        <w:rPr>
+          <w:rStyle w:val="SectionNumber"/>
+        </w:rPr>
+        <w:t xml:space="preserve">3.2</w:t>
+      </w:r>
+      <w:r>
+        <w:tab/>
+      </w:r>
+      <w:r>
         <w:t xml:space="preserve">Models</w:t>
       </w:r>
     </w:p>
@@ -3428,6 +3527,15 @@
         <w:pStyle w:val="Heading2"/>
       </w:pPr>
       <w:r>
+        <w:rPr>
+          <w:rStyle w:val="SectionNumber"/>
+        </w:rPr>
+        <w:t xml:space="preserve">3.3</w:t>
+      </w:r>
+      <w:r>
+        <w:tab/>
+      </w:r>
+      <w:r>
         <w:t xml:space="preserve">Prompt Strategies</w:t>
       </w:r>
     </w:p>
@@ -3660,6 +3768,15 @@
       <w:pPr>
         <w:pStyle w:val="Heading2"/>
       </w:pPr>
+      <w:r>
+        <w:rPr>
+          <w:rStyle w:val="SectionNumber"/>
+        </w:rPr>
+        <w:t xml:space="preserve">3.4</w:t>
+      </w:r>
+      <w:r>
+        <w:tab/>
+      </w:r>
       <w:r>
         <w:t xml:space="preserve">Class-Aware Prompt Ensemble (CAPE): A Domain-Specific Prompt Recipe</w:t>
       </w:r>
@@ -4297,21 +4414,7 @@
         <w:t xml:space="preserve"> </w:t>
       </w:r>
       <w:r>
-        <w:t xml:space="preserve">denotes L2-normalization. This matches the explicit normalization step in</w:t>
-      </w:r>
-      <w:r>
-        <w:t xml:space="preserve"> </w:t>
-      </w:r>
-      <w:hyperlink w:anchor="alg:cape">
-        <w:r>
-          <w:rPr>
-            <w:rStyle w:val="Hyperlink"/>
-          </w:rPr>
-          <w:t xml:space="preserve">[alg:cape]</w:t>
-        </w:r>
-      </w:hyperlink>
-      <w:r>
-        <w:t xml:space="preserve">.</w:t>
+        <w:t xml:space="preserve">denotes L2-normalization. This matches the explicit normalization step in Algorithm 1.</w:t>
       </w:r>
       <w:r>
         <w:t xml:space="preserve"> </w:t>
@@ -4486,20 +4589,946 @@
       <w:r>
         <w:t xml:space="preserve"> </w:t>
       </w:r>
-      <w:hyperlink w:anchor="alg:cape">
-        <w:r>
-          <w:rPr>
-            <w:rStyle w:val="Hyperlink"/>
-          </w:rPr>
-          <w:t xml:space="preserve">[alg:cape]</w:t>
-        </w:r>
-      </w:hyperlink>
-      <w:r>
-        <w:t xml:space="preserve"> </w:t>
-      </w:r>
-      <w:r>
-        <w:t xml:space="preserve">summarizes the complete inference procedure.</w:t>
-      </w:r>
+      <w:r>
+        <w:t xml:space="preserve">Algorithm 1 summarizes the complete inference procedure.</w:t>
+      </w:r>
+    </w:p>
+    <w:p>
+      <w:pPr>
+        <w:pStyle w:val="BodyText"/>
+      </w:pPr>
+      <w:r>
+        <w:rPr>
+          <w:b/>
+          <w:bCs/>
+        </w:rPr>
+        <w:t xml:space="preserve">Algorithm 1: CAPE: Class-Aware Prompt Ensemble Inference</w:t>
+      </w:r>
+    </w:p>
+    <w:p>
+      <w:pPr>
+        <w:pStyle w:val="BlockText"/>
+      </w:pPr>
+      <w:r>
+        <w:rPr>
+          <w:b/>
+          <w:bCs/>
+        </w:rPr>
+        <w:t xml:space="preserve">Input:</w:t>
+      </w:r>
+      <w:r>
+        <w:t xml:space="preserve"> </w:t>
+      </w:r>
+      <w:r>
+        <w:t xml:space="preserve">Image set</w:t>
+      </w:r>
+      <w:r>
+        <w:t xml:space="preserve"> </w:t>
+      </w:r>
+      <m:oMath>
+        <m:r>
+          <m:rPr>
+            <m:scr m:val="script"/>
+            <m:sty m:val="p"/>
+          </m:rPr>
+          <m:t>X</m:t>
+        </m:r>
+      </m:oMath>
+      <w:r>
+        <w:t xml:space="preserve">; class set</w:t>
+      </w:r>
+      <w:r>
+        <w:t xml:space="preserve"> </w:t>
+      </w:r>
+      <m:oMath>
+        <m:r>
+          <m:rPr>
+            <m:scr m:val="script"/>
+            <m:sty m:val="p"/>
+          </m:rPr>
+          <m:t>C</m:t>
+        </m:r>
+        <m:r>
+          <m:rPr>
+            <m:sty m:val="p"/>
+          </m:rPr>
+          <m:t>=</m:t>
+        </m:r>
+        <m:r>
+          <m:rPr>
+            <m:sty m:val="p"/>
+          </m:rPr>
+          <m:t>{</m:t>
+        </m:r>
+        <m:sSub>
+          <m:e>
+            <m:r>
+              <m:t>c</m:t>
+            </m:r>
+          </m:e>
+          <m:sub>
+            <m:r>
+              <m:t>1</m:t>
+            </m:r>
+          </m:sub>
+        </m:sSub>
+        <m:r>
+          <m:rPr>
+            <m:sty m:val="p"/>
+          </m:rPr>
+          <m:t>,</m:t>
+        </m:r>
+        <m:r>
+          <m:rPr>
+            <m:sty m:val="p"/>
+          </m:rPr>
+          <m:t>…</m:t>
+        </m:r>
+        <m:r>
+          <m:rPr>
+            <m:sty m:val="p"/>
+          </m:rPr>
+          <m:t>,</m:t>
+        </m:r>
+        <m:sSub>
+          <m:e>
+            <m:r>
+              <m:t>c</m:t>
+            </m:r>
+          </m:e>
+          <m:sub>
+            <m:r>
+              <m:t>K</m:t>
+            </m:r>
+          </m:sub>
+        </m:sSub>
+        <m:r>
+          <m:rPr>
+            <m:sty m:val="p"/>
+          </m:rPr>
+          <m:t>}</m:t>
+        </m:r>
+      </m:oMath>
+      <w:r>
+        <w:t xml:space="preserve">; per-class prompt sets</w:t>
+      </w:r>
+      <w:r>
+        <w:t xml:space="preserve"> </w:t>
+      </w:r>
+      <m:oMath>
+        <m:r>
+          <m:rPr>
+            <m:sty m:val="p"/>
+          </m:rPr>
+          <m:t>{</m:t>
+        </m:r>
+        <m:sSub>
+          <m:e>
+            <m:r>
+              <m:t>P</m:t>
+            </m:r>
+          </m:e>
+          <m:sub>
+            <m:sSub>
+              <m:e>
+                <m:r>
+                  <m:t>c</m:t>
+                </m:r>
+              </m:e>
+              <m:sub>
+                <m:r>
+                  <m:t>1</m:t>
+                </m:r>
+              </m:sub>
+            </m:sSub>
+          </m:sub>
+        </m:sSub>
+        <m:r>
+          <m:rPr>
+            <m:sty m:val="p"/>
+          </m:rPr>
+          <m:t>,</m:t>
+        </m:r>
+        <m:r>
+          <m:rPr>
+            <m:sty m:val="p"/>
+          </m:rPr>
+          <m:t>…</m:t>
+        </m:r>
+        <m:r>
+          <m:rPr>
+            <m:sty m:val="p"/>
+          </m:rPr>
+          <m:t>,</m:t>
+        </m:r>
+        <m:sSub>
+          <m:e>
+            <m:r>
+              <m:t>P</m:t>
+            </m:r>
+          </m:e>
+          <m:sub>
+            <m:sSub>
+              <m:e>
+                <m:r>
+                  <m:t>c</m:t>
+                </m:r>
+              </m:e>
+              <m:sub>
+                <m:r>
+                  <m:t>K</m:t>
+                </m:r>
+              </m:sub>
+            </m:sSub>
+          </m:sub>
+        </m:sSub>
+        <m:r>
+          <m:rPr>
+            <m:sty m:val="p"/>
+          </m:rPr>
+          <m:t>}</m:t>
+        </m:r>
+      </m:oMath>
+      <w:r>
+        <w:t xml:space="preserve">; vision encoder</w:t>
+      </w:r>
+      <w:r>
+        <w:t xml:space="preserve"> </w:t>
+      </w:r>
+      <m:oMath>
+        <m:sSub>
+          <m:e>
+            <m:r>
+              <m:t>f</m:t>
+            </m:r>
+          </m:e>
+          <m:sub>
+            <m:r>
+              <m:rPr>
+                <m:nor/>
+                <m:sty m:val="p"/>
+              </m:rPr>
+              <m:t>img</m:t>
+            </m:r>
+          </m:sub>
+        </m:sSub>
+      </m:oMath>
+      <w:r>
+        <w:t xml:space="preserve">; text encoder</w:t>
+      </w:r>
+      <w:r>
+        <w:t xml:space="preserve"> </w:t>
+      </w:r>
+      <m:oMath>
+        <m:sSub>
+          <m:e>
+            <m:r>
+              <m:t>f</m:t>
+            </m:r>
+          </m:e>
+          <m:sub>
+            <m:r>
+              <m:rPr>
+                <m:nor/>
+                <m:sty m:val="p"/>
+              </m:rPr>
+              <m:t>text</m:t>
+            </m:r>
+          </m:sub>
+        </m:sSub>
+      </m:oMath>
+      <w:r>
+        <w:br/>
+      </w:r>
+      <w:r>
+        <w:rPr>
+          <w:b/>
+          <w:bCs/>
+        </w:rPr>
+        <w:t xml:space="preserve">Output:</w:t>
+      </w:r>
+      <w:r>
+        <w:t xml:space="preserve"> </w:t>
+      </w:r>
+      <w:r>
+        <w:t xml:space="preserve">Predicted label</w:t>
+      </w:r>
+      <w:r>
+        <w:t xml:space="preserve"> </w:t>
+      </w:r>
+      <m:oMath>
+        <m:sSub>
+          <m:e>
+            <m:acc>
+              <m:accPr>
+                <m:chr m:val="̂"/>
+              </m:accPr>
+              <m:e>
+                <m:r>
+                  <m:t>y</m:t>
+                </m:r>
+              </m:e>
+            </m:acc>
+          </m:e>
+          <m:sub>
+            <m:r>
+              <m:t>i</m:t>
+            </m:r>
+          </m:sub>
+        </m:sSub>
+      </m:oMath>
+      <w:r>
+        <w:t xml:space="preserve"> </w:t>
+      </w:r>
+      <w:r>
+        <w:t xml:space="preserve">for each image</w:t>
+      </w:r>
+      <w:r>
+        <w:t xml:space="preserve"> </w:t>
+      </w:r>
+      <m:oMath>
+        <m:sSub>
+          <m:e>
+            <m:r>
+              <m:t>x</m:t>
+            </m:r>
+          </m:e>
+          <m:sub>
+            <m:r>
+              <m:t>i</m:t>
+            </m:r>
+          </m:sub>
+        </m:sSub>
+      </m:oMath>
+      <w:r>
+        <w:br/>
+      </w:r>
+      <w:r>
+        <w:rPr>
+          <w:i/>
+          <w:iCs/>
+        </w:rPr>
+        <w:t xml:space="preserve">Stage 1: Compute class-aware text embeddings (offline)</w:t>
+      </w:r>
+      <w:r>
+        <w:br/>
+      </w:r>
+      <w:r>
+        <w:rPr>
+          <w:b/>
+          <w:bCs/>
+        </w:rPr>
+        <w:t xml:space="preserve">For</w:t>
+      </w:r>
+      <w:r>
+        <w:t xml:space="preserve"> </w:t>
+      </w:r>
+      <w:r>
+        <w:t xml:space="preserve">each class</w:t>
+      </w:r>
+      <w:r>
+        <w:t xml:space="preserve"> </w:t>
+      </w:r>
+      <m:oMath>
+        <m:r>
+          <m:t>c</m:t>
+        </m:r>
+        <m:r>
+          <m:rPr>
+            <m:sty m:val="p"/>
+          </m:rPr>
+          <m:t>∈</m:t>
+        </m:r>
+        <m:r>
+          <m:rPr>
+            <m:scr m:val="script"/>
+            <m:sty m:val="p"/>
+          </m:rPr>
+          <m:t>C</m:t>
+        </m:r>
+      </m:oMath>
+      <w:r>
+        <w:t xml:space="preserve">:</w:t>
+      </w:r>
+      <w:r>
+        <w:br/>
+      </w:r>
+      <m:oMath>
+        <m:sSub>
+          <m:e>
+            <m:acc>
+              <m:accPr>
+                <m:chr m:val="̃"/>
+              </m:accPr>
+              <m:e>
+                <m:r>
+                  <m:rPr>
+                    <m:sty m:val="bi"/>
+                  </m:rPr>
+                  <m:t>t</m:t>
+                </m:r>
+              </m:e>
+            </m:acc>
+          </m:e>
+          <m:sub>
+            <m:r>
+              <m:t>c</m:t>
+            </m:r>
+          </m:sub>
+        </m:sSub>
+        <m:r>
+          <m:rPr>
+            <m:sty m:val="p"/>
+          </m:rPr>
+          <m:t>←</m:t>
+        </m:r>
+        <m:f>
+          <m:fPr>
+            <m:type m:val="bar"/>
+          </m:fPr>
+          <m:num>
+            <m:r>
+              <m:t>1</m:t>
+            </m:r>
+          </m:num>
+          <m:den>
+            <m:r>
+              <m:rPr>
+                <m:sty m:val="p"/>
+              </m:rPr>
+              <m:t>|</m:t>
+            </m:r>
+            <m:sSub>
+              <m:e>
+                <m:r>
+                  <m:t>P</m:t>
+                </m:r>
+              </m:e>
+              <m:sub>
+                <m:r>
+                  <m:t>c</m:t>
+                </m:r>
+              </m:sub>
+            </m:sSub>
+            <m:r>
+              <m:rPr>
+                <m:sty m:val="p"/>
+              </m:rPr>
+              <m:t>|</m:t>
+            </m:r>
+          </m:den>
+        </m:f>
+        <m:nary>
+          <m:naryPr>
+            <m:chr m:val="∑"/>
+            <m:limLoc m:val="undOvr"/>
+            <m:subHide m:val="off"/>
+            <m:supHide m:val="on"/>
+          </m:naryPr>
+          <m:sub>
+            <m:r>
+              <m:t>p</m:t>
+            </m:r>
+            <m:r>
+              <m:rPr>
+                <m:sty m:val="p"/>
+              </m:rPr>
+              <m:t>∈</m:t>
+            </m:r>
+            <m:sSub>
+              <m:e>
+                <m:r>
+                  <m:t>P</m:t>
+                </m:r>
+              </m:e>
+              <m:sub>
+                <m:r>
+                  <m:t>c</m:t>
+                </m:r>
+              </m:sub>
+            </m:sSub>
+          </m:sub>
+          <m:sup>
+            <m:r>
+              <m:t>​</m:t>
+            </m:r>
+          </m:sup>
+          <m:e>
+            <m:sSub>
+              <m:e>
+                <m:r>
+                  <m:t>f</m:t>
+                </m:r>
+              </m:e>
+              <m:sub>
+                <m:r>
+                  <m:rPr>
+                    <m:nor/>
+                    <m:sty m:val="p"/>
+                  </m:rPr>
+                  <m:t>text</m:t>
+                </m:r>
+              </m:sub>
+            </m:sSub>
+          </m:e>
+        </m:nary>
+        <m:r>
+          <m:rPr>
+            <m:sty m:val="p"/>
+          </m:rPr>
+          <m:t>(</m:t>
+        </m:r>
+        <m:r>
+          <m:t>p</m:t>
+        </m:r>
+        <m:r>
+          <m:rPr>
+            <m:sty m:val="p"/>
+          </m:rPr>
+          <m:t>)</m:t>
+        </m:r>
+      </m:oMath>
+      <w:r>
+        <w:t xml:space="preserve"> </w:t>
+      </w:r>
+      <w:r>
+        <w:t xml:space="preserve">(</w:t>
+      </w:r>
+      <w:r>
+        <w:rPr>
+          <w:i/>
+          <w:iCs/>
+        </w:rPr>
+        <w:t xml:space="preserve">mean-pool prompt embeddings</w:t>
+      </w:r>
+      <w:r>
+        <w:t xml:space="preserve">)</w:t>
+      </w:r>
+      <w:r>
+        <w:br/>
+      </w:r>
+      <m:oMath>
+        <m:sSub>
+          <m:e>
+            <m:r>
+              <m:rPr>
+                <m:sty m:val="bi"/>
+              </m:rPr>
+              <m:t>t</m:t>
+            </m:r>
+          </m:e>
+          <m:sub>
+            <m:r>
+              <m:t>c</m:t>
+            </m:r>
+          </m:sub>
+        </m:sSub>
+        <m:r>
+          <m:rPr>
+            <m:sty m:val="p"/>
+          </m:rPr>
+          <m:t>←</m:t>
+        </m:r>
+        <m:sSub>
+          <m:e>
+            <m:r>
+              <m:t>ℓ</m:t>
+            </m:r>
+          </m:e>
+          <m:sub>
+            <m:r>
+              <m:t>2</m:t>
+            </m:r>
+          </m:sub>
+        </m:sSub>
+        <m:r>
+          <m:t>​</m:t>
+        </m:r>
+        <m:d>
+          <m:dPr>
+            <m:begChr m:val="("/>
+            <m:sepChr m:val=""/>
+            <m:endChr m:val=")"/>
+            <m:grow/>
+          </m:dPr>
+          <m:e>
+            <m:sSub>
+              <m:e>
+                <m:acc>
+                  <m:accPr>
+                    <m:chr m:val="̃"/>
+                  </m:accPr>
+                  <m:e>
+                    <m:r>
+                      <m:rPr>
+                        <m:sty m:val="bi"/>
+                      </m:rPr>
+                      <m:t>t</m:t>
+                    </m:r>
+                  </m:e>
+                </m:acc>
+              </m:e>
+              <m:sub>
+                <m:r>
+                  <m:t>c</m:t>
+                </m:r>
+              </m:sub>
+            </m:sSub>
+          </m:e>
+        </m:d>
+      </m:oMath>
+      <w:r>
+        <w:t xml:space="preserve"> </w:t>
+      </w:r>
+      <w:r>
+        <w:t xml:space="preserve">(</w:t>
+      </w:r>
+      <w:r>
+        <w:rPr>
+          <w:i/>
+          <w:iCs/>
+        </w:rPr>
+        <w:t xml:space="preserve">L2-normalize</w:t>
+      </w:r>
+      <w:r>
+        <w:t xml:space="preserve">)</w:t>
+      </w:r>
+      <w:r>
+        <w:br/>
+      </w:r>
+      <w:r>
+        <w:rPr>
+          <w:i/>
+          <w:iCs/>
+        </w:rPr>
+        <w:t xml:space="preserve">Stage 2: Zero-shot classification (per image)</w:t>
+      </w:r>
+      <w:r>
+        <w:br/>
+      </w:r>
+      <w:r>
+        <w:rPr>
+          <w:b/>
+          <w:bCs/>
+        </w:rPr>
+        <w:t xml:space="preserve">For</w:t>
+      </w:r>
+      <w:r>
+        <w:t xml:space="preserve"> </w:t>
+      </w:r>
+      <w:r>
+        <w:t xml:space="preserve">each image</w:t>
+      </w:r>
+      <w:r>
+        <w:t xml:space="preserve"> </w:t>
+      </w:r>
+      <m:oMath>
+        <m:sSub>
+          <m:e>
+            <m:r>
+              <m:t>x</m:t>
+            </m:r>
+          </m:e>
+          <m:sub>
+            <m:r>
+              <m:t>i</m:t>
+            </m:r>
+          </m:sub>
+        </m:sSub>
+        <m:r>
+          <m:rPr>
+            <m:sty m:val="p"/>
+          </m:rPr>
+          <m:t>∈</m:t>
+        </m:r>
+        <m:r>
+          <m:rPr>
+            <m:scr m:val="script"/>
+            <m:sty m:val="p"/>
+          </m:rPr>
+          <m:t>X</m:t>
+        </m:r>
+      </m:oMath>
+      <w:r>
+        <w:t xml:space="preserve">:</w:t>
+      </w:r>
+      <w:r>
+        <w:br/>
+      </w:r>
+      <m:oMath>
+        <m:sSub>
+          <m:e>
+            <m:r>
+              <m:rPr>
+                <m:sty m:val="bi"/>
+              </m:rPr>
+              <m:t>v</m:t>
+            </m:r>
+          </m:e>
+          <m:sub>
+            <m:r>
+              <m:t>i</m:t>
+            </m:r>
+          </m:sub>
+        </m:sSub>
+        <m:r>
+          <m:rPr>
+            <m:sty m:val="p"/>
+          </m:rPr>
+          <m:t>←</m:t>
+        </m:r>
+        <m:sSub>
+          <m:e>
+            <m:r>
+              <m:t>ℓ</m:t>
+            </m:r>
+          </m:e>
+          <m:sub>
+            <m:r>
+              <m:t>2</m:t>
+            </m:r>
+          </m:sub>
+        </m:sSub>
+        <m:r>
+          <m:t>​</m:t>
+        </m:r>
+        <m:d>
+          <m:dPr>
+            <m:begChr m:val="("/>
+            <m:sepChr m:val=""/>
+            <m:endChr m:val=")"/>
+            <m:grow/>
+          </m:dPr>
+          <m:e>
+            <m:sSub>
+              <m:e>
+                <m:r>
+                  <m:t>f</m:t>
+                </m:r>
+              </m:e>
+              <m:sub>
+                <m:r>
+                  <m:rPr>
+                    <m:nor/>
+                    <m:sty m:val="p"/>
+                  </m:rPr>
+                  <m:t>img</m:t>
+                </m:r>
+              </m:sub>
+            </m:sSub>
+            <m:r>
+              <m:rPr>
+                <m:sty m:val="p"/>
+              </m:rPr>
+              <m:t>(</m:t>
+            </m:r>
+            <m:sSub>
+              <m:e>
+                <m:r>
+                  <m:t>x</m:t>
+                </m:r>
+              </m:e>
+              <m:sub>
+                <m:r>
+                  <m:t>i</m:t>
+                </m:r>
+              </m:sub>
+            </m:sSub>
+            <m:r>
+              <m:rPr>
+                <m:sty m:val="p"/>
+              </m:rPr>
+              <m:t>)</m:t>
+            </m:r>
+          </m:e>
+        </m:d>
+      </m:oMath>
+      <w:r>
+        <w:t xml:space="preserve"> </w:t>
+      </w:r>
+      <w:r>
+        <w:t xml:space="preserve">(</w:t>
+      </w:r>
+      <w:r>
+        <w:rPr>
+          <w:i/>
+          <w:iCs/>
+        </w:rPr>
+        <w:t xml:space="preserve">encode &amp; normalize</w:t>
+      </w:r>
+      <w:r>
+        <w:t xml:space="preserve">)</w:t>
+      </w:r>
+      <w:r>
+        <w:br/>
+      </w:r>
+      <m:oMath>
+        <m:sSub>
+          <m:e>
+            <m:acc>
+              <m:accPr>
+                <m:chr m:val="̂"/>
+              </m:accPr>
+              <m:e>
+                <m:r>
+                  <m:t>y</m:t>
+                </m:r>
+              </m:e>
+            </m:acc>
+          </m:e>
+          <m:sub>
+            <m:r>
+              <m:t>i</m:t>
+            </m:r>
+          </m:sub>
+        </m:sSub>
+        <m:r>
+          <m:rPr>
+            <m:sty m:val="p"/>
+          </m:rPr>
+          <m:t>←</m:t>
+        </m:r>
+        <m:r>
+          <m:rPr>
+            <m:sty m:val="p"/>
+          </m:rPr>
+          <m:t>arg</m:t>
+        </m:r>
+        <m:sSub>
+          <m:e>
+            <m:r>
+              <m:rPr>
+                <m:sty m:val="p"/>
+              </m:rPr>
+              <m:t>max</m:t>
+            </m:r>
+          </m:e>
+          <m:sub>
+            <m:r>
+              <m:t>c</m:t>
+            </m:r>
+            <m:r>
+              <m:rPr>
+                <m:sty m:val="p"/>
+              </m:rPr>
+              <m:t>∈</m:t>
+            </m:r>
+            <m:r>
+              <m:rPr>
+                <m:scr m:val="script"/>
+                <m:sty m:val="p"/>
+              </m:rPr>
+              <m:t>C</m:t>
+            </m:r>
+          </m:sub>
+        </m:sSub>
+        <m:r>
+          <m:t> </m:t>
+        </m:r>
+        <m:sSubSup>
+          <m:e>
+            <m:r>
+              <m:rPr>
+                <m:sty m:val="bi"/>
+              </m:rPr>
+              <m:t>v</m:t>
+            </m:r>
+          </m:e>
+          <m:sub>
+            <m:r>
+              <m:t>i</m:t>
+            </m:r>
+          </m:sub>
+          <m:sup>
+            <m:r>
+              <m:t>​</m:t>
+            </m:r>
+            <m:r>
+              <m:rPr>
+                <m:sty m:val="p"/>
+              </m:rPr>
+              <m:t>⊤</m:t>
+            </m:r>
+          </m:sup>
+        </m:sSubSup>
+        <m:sSub>
+          <m:e>
+            <m:r>
+              <m:rPr>
+                <m:sty m:val="bi"/>
+              </m:rPr>
+              <m:t>t</m:t>
+            </m:r>
+          </m:e>
+          <m:sub>
+            <m:r>
+              <m:t>c</m:t>
+            </m:r>
+          </m:sub>
+        </m:sSub>
+      </m:oMath>
+      <w:r>
+        <w:t xml:space="preserve"> </w:t>
+      </w:r>
+      <w:r>
+        <w:t xml:space="preserve">(</w:t>
+      </w:r>
+      <w:r>
+        <w:rPr>
+          <w:i/>
+          <w:iCs/>
+        </w:rPr>
+        <w:t xml:space="preserve">cosine similarity</w:t>
+      </w:r>
+      <w:r>
+        <w:t xml:space="preserve">)</w:t>
+      </w:r>
+      <w:r>
+        <w:br/>
+      </w:r>
+      <w:r>
+        <w:rPr>
+          <w:b/>
+          <w:bCs/>
+        </w:rPr>
+        <w:t xml:space="preserve">Return:</w:t>
+      </w:r>
+      <w:r>
+        <w:t xml:space="preserve"> </w:t>
+      </w:r>
+      <m:oMath>
+        <m:r>
+          <m:rPr>
+            <m:sty m:val="p"/>
+          </m:rPr>
+          <m:t>{</m:t>
+        </m:r>
+        <m:sSub>
+          <m:e>
+            <m:acc>
+              <m:accPr>
+                <m:chr m:val="̂"/>
+              </m:accPr>
+              <m:e>
+                <m:r>
+                  <m:t>y</m:t>
+                </m:r>
+              </m:e>
+            </m:acc>
+          </m:e>
+          <m:sub>
+            <m:r>
+              <m:t>i</m:t>
+            </m:r>
+          </m:sub>
+        </m:sSub>
+        <m:r>
+          <m:rPr>
+            <m:sty m:val="p"/>
+          </m:rPr>
+          <m:t>}</m:t>
+        </m:r>
+      </m:oMath>
     </w:p>
     <w:bookmarkEnd w:id="28"/>
     <w:bookmarkStart w:id="32" w:name="sec:eval_protocol"/>
@@ -4508,6 +5537,15 @@
         <w:pStyle w:val="Heading2"/>
       </w:pPr>
       <w:r>
+        <w:rPr>
+          <w:rStyle w:val="SectionNumber"/>
+        </w:rPr>
+        <w:t xml:space="preserve">3.5</w:t>
+      </w:r>
+      <w:r>
+        <w:tab/>
+      </w:r>
+      <w:r>
         <w:t xml:space="preserve">Evaluation Protocol</w:t>
       </w:r>
     </w:p>
@@ -4524,6 +5562,15 @@
       <w:pPr>
         <w:pStyle w:val="Heading4"/>
       </w:pPr>
+      <w:r>
+        <w:rPr>
+          <w:rStyle w:val="SectionNumber"/>
+        </w:rPr>
+        <w:t xml:space="preserve">3.5.0.1</w:t>
+      </w:r>
+      <w:r>
+        <w:tab/>
+      </w:r>
       <w:r>
         <w:t xml:space="preserve">Multi-label Hit@1 (Hit@1).</w:t>
       </w:r>
@@ -4730,6 +5777,15 @@
         <w:pStyle w:val="Heading4"/>
       </w:pPr>
       <w:r>
+        <w:rPr>
+          <w:rStyle w:val="SectionNumber"/>
+        </w:rPr>
+        <w:t xml:space="preserve">3.5.0.2</w:t>
+      </w:r>
+      <w:r>
+        <w:tab/>
+      </w:r>
+      <w:r>
         <w:t xml:space="preserve">Multi-label Hit@3 (Hit@3).</w:t>
       </w:r>
     </w:p>
@@ -4747,6 +5803,15 @@
       <w:pPr>
         <w:pStyle w:val="Heading4"/>
       </w:pPr>
+      <w:r>
+        <w:rPr>
+          <w:rStyle w:val="SectionNumber"/>
+        </w:rPr>
+        <w:t xml:space="preserve">3.5.0.3</w:t>
+      </w:r>
+      <w:r>
+        <w:tab/>
+      </w:r>
       <w:r>
         <w:t xml:space="preserve">Single-label (Primary) Metrics.</w:t>
       </w:r>
@@ -4822,6 +5887,15 @@
         <w:pStyle w:val="Heading2"/>
       </w:pPr>
       <w:r>
+        <w:rPr>
+          <w:rStyle w:val="SectionNumber"/>
+        </w:rPr>
+        <w:t xml:space="preserve">3.6</w:t>
+      </w:r>
+      <w:r>
+        <w:tab/>
+      </w:r>
+      <w:r>
         <w:t xml:space="preserve">MLLM Evaluation Protocol</w:t>
       </w:r>
     </w:p>
@@ -4875,6 +5949,15 @@
         <w:pStyle w:val="Heading1"/>
       </w:pPr>
       <w:r>
+        <w:rPr>
+          <w:rStyle w:val="SectionNumber"/>
+        </w:rPr>
+        <w:t xml:space="preserve">4</w:t>
+      </w:r>
+      <w:r>
+        <w:tab/>
+      </w:r>
+      <w:r>
         <w:t xml:space="preserve">Experiments</w:t>
       </w:r>
     </w:p>
@@ -4883,6 +5966,15 @@
       <w:pPr>
         <w:pStyle w:val="Heading2"/>
       </w:pPr>
+      <w:r>
+        <w:rPr>
+          <w:rStyle w:val="SectionNumber"/>
+        </w:rPr>
+        <w:t xml:space="preserve">4.1</w:t>
+      </w:r>
+      <w:r>
+        <w:tab/>
+      </w:r>
       <w:r>
         <w:t xml:space="preserve">Experimental Setup</w:t>
       </w:r>
@@ -4954,6 +6046,15 @@
       <w:pPr>
         <w:pStyle w:val="Heading4"/>
       </w:pPr>
+      <w:r>
+        <w:rPr>
+          <w:rStyle w:val="SectionNumber"/>
+        </w:rPr>
+        <w:t xml:space="preserve">4.1.0.1</w:t>
+      </w:r>
+      <w:r>
+        <w:tab/>
+      </w:r>
       <w:r>
         <w:t xml:space="preserve">Computational overhead of CAPE.</w:t>
       </w:r>
@@ -5159,6 +6260,15 @@
         <w:pStyle w:val="Heading2"/>
       </w:pPr>
       <w:r>
+        <w:rPr>
+          <w:rStyle w:val="SectionNumber"/>
+        </w:rPr>
+        <w:t xml:space="preserve">4.2</w:t>
+      </w:r>
+      <w:r>
+        <w:tab/>
+      </w:r>
+      <w:r>
         <w:t xml:space="preserve">Headline performance and prompt design</w:t>
       </w:r>
     </w:p>
@@ -5167,6 +6277,15 @@
       <w:pPr>
         <w:pStyle w:val="Heading3"/>
       </w:pPr>
+      <w:r>
+        <w:rPr>
+          <w:rStyle w:val="SectionNumber"/>
+        </w:rPr>
+        <w:t xml:space="preserve">4.2.1</w:t>
+      </w:r>
+      <w:r>
+        <w:tab/>
+      </w:r>
       <w:r>
         <w:t xml:space="preserve">E1: Cross-Dataset Model Comparison</w:t>
       </w:r>
@@ -6625,7 +7744,7 @@
               <w:jc w:val="center"/>
             </w:pPr>
             <w:r>
-              <w:t xml:space="preserve">16.42</w:t>
+              <w:t xml:space="preserve">16.42§</w:t>
             </w:r>
           </w:p>
         </w:tc>
@@ -7530,10 +8649,7 @@
         <w:br/>
       </w:r>
       <w:r>
-        <w:t xml:space="preserve">$^{\S}$</w:t>
-      </w:r>
-      <w:r>
-        <w:t xml:space="preserve"> Equals the multi-label majority floor (16.42%), indicating degenerate prediction toward the most prevalent class (</w:t>
+        <w:t xml:space="preserve">§ Equals the multi-label majority floor (16.42%), indicating degenerate prediction toward the most prevalent class (</w:t>
       </w:r>
       <w:r>
         <w:t xml:space="preserve">“teacher”</w:t>
@@ -7560,6 +8676,15 @@
       <w:pPr>
         <w:pStyle w:val="Heading3"/>
       </w:pPr>
+      <w:r>
+        <w:rPr>
+          <w:rStyle w:val="SectionNumber"/>
+        </w:rPr>
+        <w:t xml:space="preserve">4.2.2</w:t>
+      </w:r>
+      <w:r>
+        <w:tab/>
+      </w:r>
       <w:r>
         <w:t xml:space="preserve">E2: Prompt Ablation</w:t>
       </w:r>
@@ -7807,6 +8932,15 @@
         <w:pStyle w:val="Heading2"/>
       </w:pPr>
       <w:r>
+        <w:rPr>
+          <w:rStyle w:val="SectionNumber"/>
+        </w:rPr>
+        <w:t xml:space="preserve">4.3</w:t>
+      </w:r>
+      <w:r>
+        <w:tab/>
+      </w:r>
+      <w:r>
         <w:t xml:space="preserve">CAPE analysis and cross-model summary</w:t>
       </w:r>
     </w:p>
@@ -7815,6 +8949,15 @@
       <w:pPr>
         <w:pStyle w:val="Heading3"/>
       </w:pPr>
+      <w:r>
+        <w:rPr>
+          <w:rStyle w:val="SectionNumber"/>
+        </w:rPr>
+        <w:t xml:space="preserve">4.3.1</w:t>
+      </w:r>
+      <w:r>
+        <w:tab/>
+      </w:r>
       <w:r>
         <w:t xml:space="preserve">E3: CAPE Effectiveness Across Scenes</w:t>
       </w:r>
@@ -8700,6 +9843,15 @@
         <w:pStyle w:val="Heading3"/>
       </w:pPr>
       <w:r>
+        <w:rPr>
+          <w:rStyle w:val="SectionNumber"/>
+        </w:rPr>
+        <w:t xml:space="preserve">4.3.2</w:t>
+      </w:r>
+      <w:r>
+        <w:tab/>
+      </w:r>
+      <w:r>
         <w:t xml:space="preserve">E4: Robustness of CAPE Prompt Ensembles</w:t>
       </w:r>
     </w:p>
@@ -8804,6 +9956,15 @@
       <w:pPr>
         <w:pStyle w:val="Heading4"/>
       </w:pPr>
+      <w:r>
+        <w:rPr>
+          <w:rStyle w:val="SectionNumber"/>
+        </w:rPr>
+        <w:t xml:space="preserve">4.3.2.1</w:t>
+      </w:r>
+      <w:r>
+        <w:tab/>
+      </w:r>
       <w:r>
         <w:t xml:space="preserve">Three-principle ablation.</w:t>
       </w:r>
@@ -9197,6 +10358,15 @@
         <w:pStyle w:val="Heading4"/>
       </w:pPr>
       <w:r>
+        <w:rPr>
+          <w:rStyle w:val="SectionNumber"/>
+        </w:rPr>
+        <w:t xml:space="preserve">4.3.2.2</w:t>
+      </w:r>
+      <w:r>
+        <w:tab/>
+      </w:r>
+      <w:r>
         <w:t xml:space="preserve">Oracle vs. non-oracle multi-label F1.</w:t>
       </w:r>
     </w:p>
@@ -10822,6 +11992,15 @@
         <w:pStyle w:val="Heading3"/>
       </w:pPr>
       <w:r>
+        <w:rPr>
+          <w:rStyle w:val="SectionNumber"/>
+        </w:rPr>
+        <w:t xml:space="preserve">4.3.3</w:t>
+      </w:r>
+      <w:r>
+        <w:tab/>
+      </w:r>
+      <w:r>
         <w:t xml:space="preserve">E5: Descriptive Cross-Model Summary</w:t>
       </w:r>
     </w:p>
@@ -11223,6 +12402,15 @@
         <w:pStyle w:val="Heading2"/>
       </w:pPr>
       <w:r>
+        <w:rPr>
+          <w:rStyle w:val="SectionNumber"/>
+        </w:rPr>
+        <w:t xml:space="preserve">4.4</w:t>
+      </w:r>
+      <w:r>
+        <w:tab/>
+      </w:r>
+      <w:r>
         <w:t xml:space="preserve">Reliability and supervised baselines</w:t>
       </w:r>
     </w:p>
@@ -11231,6 +12419,15 @@
       <w:pPr>
         <w:pStyle w:val="Heading3"/>
       </w:pPr>
+      <w:r>
+        <w:rPr>
+          <w:rStyle w:val="SectionNumber"/>
+        </w:rPr>
+        <w:t xml:space="preserve">4.4.1</w:t>
+      </w:r>
+      <w:r>
+        <w:tab/>
+      </w:r>
       <w:r>
         <w:t xml:space="preserve">E6: Error Analysis and Class-Level Behavior</w:t>
       </w:r>
@@ -11909,6 +13106,15 @@
         <w:pStyle w:val="Heading3"/>
       </w:pPr>
       <w:r>
+        <w:rPr>
+          <w:rStyle w:val="SectionNumber"/>
+        </w:rPr>
+        <w:t xml:space="preserve">4.4.2</w:t>
+      </w:r>
+      <w:r>
+        <w:tab/>
+      </w:r>
+      <w:r>
         <w:t xml:space="preserve">E7: Supervised Baseline via Linear Probing</w:t>
       </w:r>
     </w:p>
@@ -13695,6 +14901,15 @@
         <w:pStyle w:val="Heading3"/>
       </w:pPr>
       <w:r>
+        <w:rPr>
+          <w:rStyle w:val="SectionNumber"/>
+        </w:rPr>
+        <w:t xml:space="preserve">4.4.3</w:t>
+      </w:r>
+      <w:r>
+        <w:tab/>
+      </w:r>
+      <w:r>
         <w:t xml:space="preserve">E8: Bootstrap Confidence Intervals</w:t>
       </w:r>
     </w:p>
@@ -13845,6 +15060,15 @@
       <w:pPr>
         <w:pStyle w:val="Heading4"/>
       </w:pPr>
+      <w:r>
+        <w:rPr>
+          <w:rStyle w:val="SectionNumber"/>
+        </w:rPr>
+        <w:t xml:space="preserve">4.4.3.1</w:t>
+      </w:r>
+      <w:r>
+        <w:tab/>
+      </w:r>
       <w:r>
         <w:t xml:space="preserve">Paired-bootstrap significance test.</w:t>
       </w:r>
@@ -16291,6 +17515,15 @@
         <w:pStyle w:val="Heading2"/>
       </w:pPr>
       <w:r>
+        <w:rPr>
+          <w:rStyle w:val="SectionNumber"/>
+        </w:rPr>
+        <w:t xml:space="preserve">4.5</w:t>
+      </w:r>
+      <w:r>
+        <w:tab/>
+      </w:r>
+      <w:r>
         <w:t xml:space="preserve">Independent validation and extensions</w:t>
       </w:r>
     </w:p>
@@ -16299,6 +17532,15 @@
       <w:pPr>
         <w:pStyle w:val="Heading3"/>
       </w:pPr>
+      <w:r>
+        <w:rPr>
+          <w:rStyle w:val="SectionNumber"/>
+        </w:rPr>
+        <w:t xml:space="preserve">4.5.1</w:t>
+      </w:r>
+      <w:r>
+        <w:tab/>
+      </w:r>
       <w:r>
         <w:t xml:space="preserve">E9: Independent Prompt Validation (Blind Set C)</w:t>
       </w:r>
@@ -18054,6 +19296,15 @@
         <w:pStyle w:val="Heading3"/>
       </w:pPr>
       <w:r>
+        <w:rPr>
+          <w:rStyle w:val="SectionNumber"/>
+        </w:rPr>
+        <w:t xml:space="preserve">4.5.2</w:t>
+      </w:r>
+      <w:r>
+        <w:tab/>
+      </w:r>
+      <w:r>
         <w:t xml:space="preserve">E10: Multi-Label Evaluation</w:t>
       </w:r>
     </w:p>
@@ -18686,6 +19937,15 @@
       <w:pPr>
         <w:pStyle w:val="Heading3"/>
       </w:pPr>
+      <w:r>
+        <w:rPr>
+          <w:rStyle w:val="SectionNumber"/>
+        </w:rPr>
+        <w:t xml:space="preserve">4.5.3</w:t>
+      </w:r>
+      <w:r>
+        <w:tab/>
+      </w:r>
       <w:r>
         <w:t xml:space="preserve">E11: Cross-Family and Cross-Prompt Validation</w:t>
       </w:r>
@@ -20048,6 +21308,15 @@
       <w:pPr>
         <w:pStyle w:val="Heading3"/>
       </w:pPr>
+      <w:r>
+        <w:rPr>
+          <w:rStyle w:val="SectionNumber"/>
+        </w:rPr>
+        <w:t xml:space="preserve">4.5.4</w:t>
+      </w:r>
+      <w:r>
+        <w:tab/>
+      </w:r>
       <w:r>
         <w:t xml:space="preserve">E12: Comparison with Generic Prompt-Engineering Baselines</w:t>
       </w:r>
@@ -21296,6 +22565,15 @@
         <w:pStyle w:val="Heading1"/>
       </w:pPr>
       <w:r>
+        <w:rPr>
+          <w:rStyle w:val="SectionNumber"/>
+        </w:rPr>
+        <w:t xml:space="preserve">5</w:t>
+      </w:r>
+      <w:r>
+        <w:tab/>
+      </w:r>
+      <w:r>
         <w:t xml:space="preserve">Discussion</w:t>
       </w:r>
     </w:p>
@@ -21304,6 +22582,15 @@
       <w:pPr>
         <w:pStyle w:val="Heading2"/>
       </w:pPr>
+      <w:r>
+        <w:rPr>
+          <w:rStyle w:val="SectionNumber"/>
+        </w:rPr>
+        <w:t xml:space="preserve">5.1</w:t>
+      </w:r>
+      <w:r>
+        <w:tab/>
+      </w:r>
       <w:r>
         <w:t xml:space="preserve">The Dominance of Prompt Design</w:t>
       </w:r>
@@ -21371,6 +22658,15 @@
       <w:pPr>
         <w:pStyle w:val="Heading2"/>
       </w:pPr>
+      <w:r>
+        <w:rPr>
+          <w:rStyle w:val="SectionNumber"/>
+        </w:rPr>
+        <w:t xml:space="preserve">5.2</w:t>
+      </w:r>
+      <w:r>
+        <w:tab/>
+      </w:r>
       <w:r>
         <w:t xml:space="preserve">Scene-Dependent Model–Prompt Interactions</w:t>
       </w:r>
@@ -21516,6 +22812,15 @@
         <w:pStyle w:val="Heading2"/>
       </w:pPr>
       <w:r>
+        <w:rPr>
+          <w:rStyle w:val="SectionNumber"/>
+        </w:rPr>
+        <w:t xml:space="preserve">5.3</w:t>
+      </w:r>
+      <w:r>
+        <w:tab/>
+      </w:r>
+      <w:r>
         <w:t xml:space="preserve">Cross-Family Validation Clarifies Robustness Across Model Families</w:t>
       </w:r>
     </w:p>
@@ -21618,6 +22923,15 @@
       <w:pPr>
         <w:pStyle w:val="Heading2"/>
       </w:pPr>
+      <w:r>
+        <w:rPr>
+          <w:rStyle w:val="SectionNumber"/>
+        </w:rPr>
+        <w:t xml:space="preserve">5.4</w:t>
+      </w:r>
+      <w:r>
+        <w:tab/>
+      </w:r>
       <w:r>
         <w:t xml:space="preserve">Prompt Complexity Is Task-Dependent, Not Universally Optimal</w:t>
       </w:r>
@@ -21911,6 +23225,15 @@
         <w:pStyle w:val="Heading2"/>
       </w:pPr>
       <w:r>
+        <w:rPr>
+          <w:rStyle w:val="SectionNumber"/>
+        </w:rPr>
+        <w:t xml:space="preserve">5.5</w:t>
+      </w:r>
+      <w:r>
+        <w:tab/>
+      </w:r>
+      <w:r>
         <w:t xml:space="preserve">Robustness to Prompt Wording Is Also Task-Dependent</w:t>
       </w:r>
     </w:p>
@@ -21977,6 +23300,15 @@
       <w:pPr>
         <w:pStyle w:val="Heading2"/>
       </w:pPr>
+      <w:r>
+        <w:rPr>
+          <w:rStyle w:val="SectionNumber"/>
+        </w:rPr>
+        <w:t xml:space="preserve">5.6</w:t>
+      </w:r>
+      <w:r>
+        <w:tab/>
+      </w:r>
       <w:r>
         <w:t xml:space="preserve">Multi-Label Hit@1 vs. Single-Label Metrics</w:t>
       </w:r>
@@ -22058,6 +23390,15 @@
         <w:pStyle w:val="Heading2"/>
       </w:pPr>
       <w:r>
+        <w:rPr>
+          <w:rStyle w:val="SectionNumber"/>
+        </w:rPr>
+        <w:t xml:space="preserve">5.7</w:t>
+      </w:r>
+      <w:r>
+        <w:tab/>
+      </w:r>
+      <w:r>
         <w:t xml:space="preserve">Supervised Baselines Contextualize Zero-Shot Value</w:t>
       </w:r>
     </w:p>
@@ -22140,6 +23481,15 @@
         <w:pStyle w:val="Heading4"/>
       </w:pPr>
       <w:r>
+        <w:rPr>
+          <w:rStyle w:val="SectionNumber"/>
+        </w:rPr>
+        <w:t xml:space="preserve">5.7.0.1</w:t>
+      </w:r>
+      <w:r>
+        <w:tab/>
+      </w:r>
+      <w:r>
         <w:t xml:space="preserve">Practical implications of the supervised–zero-shot gap.</w:t>
       </w:r>
     </w:p>
@@ -22158,6 +23508,15 @@
       <w:pPr>
         <w:pStyle w:val="Heading2"/>
       </w:pPr>
+      <w:r>
+        <w:rPr>
+          <w:rStyle w:val="SectionNumber"/>
+        </w:rPr>
+        <w:t xml:space="preserve">5.8</w:t>
+      </w:r>
+      <w:r>
+        <w:tab/>
+      </w:r>
       <w:r>
         <w:t xml:space="preserve">Statistical Reliability</w:t>
       </w:r>
@@ -22205,6 +23564,15 @@
         <w:pStyle w:val="Heading2"/>
       </w:pPr>
       <w:r>
+        <w:rPr>
+          <w:rStyle w:val="SectionNumber"/>
+        </w:rPr>
+        <w:t xml:space="preserve">5.9</w:t>
+      </w:r>
+      <w:r>
+        <w:tab/>
+      </w:r>
+      <w:r>
         <w:t xml:space="preserve">Implications for Intelligent Classroom Systems</w:t>
       </w:r>
     </w:p>
@@ -22222,6 +23590,15 @@
       <w:pPr>
         <w:pStyle w:val="Heading2"/>
       </w:pPr>
+      <w:r>
+        <w:rPr>
+          <w:rStyle w:val="SectionNumber"/>
+        </w:rPr>
+        <w:t xml:space="preserve">5.10</w:t>
+      </w:r>
+      <w:r>
+        <w:tab/>
+      </w:r>
       <w:r>
         <w:t xml:space="preserve">Limitations</w:t>
       </w:r>
@@ -22367,6 +23744,15 @@
         <w:pStyle w:val="Heading1"/>
       </w:pPr>
       <w:r>
+        <w:rPr>
+          <w:rStyle w:val="SectionNumber"/>
+        </w:rPr>
+        <w:t xml:space="preserve">6</w:t>
+      </w:r>
+      <w:r>
+        <w:tab/>
+      </w:r>
+      <w:r>
         <w:t xml:space="preserve">Conclusions</w:t>
       </w:r>
     </w:p>
@@ -22565,7 +23951,7 @@
       </w:r>
     </w:p>
     <w:bookmarkEnd w:id="115"/>
-    <w:bookmarkStart w:id="117" w:name="conflictsofinterest"/>
+    <w:bookmarkStart w:id="129" w:name="conflictsofinterest"/>
     <w:p>
       <w:pPr>
         <w:pStyle w:val="Heading1"/>
@@ -22593,7 +23979,7 @@
         <w:t xml:space="preserve">0cm</w:t>
       </w:r>
     </w:p>
-    <w:bookmarkStart w:id="116" w:name="reftitle"/>
+    <w:bookmarkStart w:id="128" w:name="reftitle"/>
     <w:p>
       <w:pPr>
         <w:pStyle w:val="Heading1"/>
@@ -22657,13 +24043,40 @@
         <w:t xml:space="preserve">Increasing Teacher Effectiveness</w:t>
       </w:r>
       <w:r>
-        <w:t xml:space="preserve">, 2nd ed.;</w:t>
-      </w:r>
-      <w:r>
-        <w:t xml:space="preserve"> </w:t>
-      </w:r>
-      <w:r>
-        <w:t xml:space="preserve">UNESCO International Institute for Educational Planning: Paris, France, 2004.</w:t>
+        <w:t xml:space="preserve">, 2nd ed.; UNESCO International Institute for Educational Planning: Paris, France, 2004.</w:t>
+      </w:r>
+    </w:p>
+    <w:p>
+      <w:pPr>
+        <w:pStyle w:val="BodyText"/>
+      </w:pPr>
+      <w:r>
+        <w:t xml:space="preserve">Dillenbourg, P.; Zufferey, G.; Alavi, H.; Jermann, P.; Do-Lenh, S.; Bonnard, Q.; Cuendet, S.; Kaplan, F.</w:t>
+      </w:r>
+      <w:r>
+        <w:t xml:space="preserve"> </w:t>
+      </w:r>
+      <w:r>
+        <w:t xml:space="preserve">Classroom Orchestration: The Third Circle of Usability.</w:t>
+      </w:r>
+      <w:r>
+        <w:t xml:space="preserve"> </w:t>
+      </w:r>
+      <w:r>
+        <w:t xml:space="preserve">In</w:t>
+      </w:r>
+      <w:r>
+        <w:t xml:space="preserve"> </w:t>
+      </w:r>
+      <w:r>
+        <w:rPr>
+          <w:i/>
+          <w:iCs/>
+        </w:rPr>
+        <w:t xml:space="preserve">Connecting Computer-Supported Collaborative Learning to Policy and Practice: CSCL2011 Conference Proceedings</w:t>
+      </w:r>
+      <w:r>
+        <w:t xml:space="preserve">; ISLS, 2011; pp. 510–517.</w:t>
       </w:r>
     </w:p>
     <w:p>
@@ -22733,20 +24146,7 @@
         <w:t xml:space="preserve"> </w:t>
       </w:r>
       <w:r>
-        <w:t xml:space="preserve">In</w:t>
-      </w:r>
-      <w:r>
-        <w:t xml:space="preserve"> </w:t>
-      </w:r>
-      <w:r>
-        <w:rPr>
-          <w:i/>
-          <w:iCs/>
-        </w:rPr>
-        <w:t xml:space="preserve">Proceedings of the 38th International Conference on Machine Learning</w:t>
-      </w:r>
-      <w:r>
-        <w:t xml:space="preserve">; Virtual, 18–24 July 2021; pp. 8748–8763.</w:t>
+        <w:t xml:space="preserve">In Proceedings of the 38th International Conference on Machine Learning (ICML), Virtual, 18–24 July 2021; pp. 8748–8763.</w:t>
       </w:r>
     </w:p>
     <w:p>
@@ -22957,7 +24357,21 @@
         <w:t xml:space="preserve">5</w:t>
       </w:r>
       <w:r>
-        <w:t xml:space="preserve">, 86–98. doi:10.1109/TAFFC.2014.2316163.</w:t>
+        <w:t xml:space="preserve">, 86–98.</w:t>
+      </w:r>
+      <w:r>
+        <w:t xml:space="preserve"> </w:t>
+      </w:r>
+      <w:hyperlink r:id="rId116">
+        <w:r>
+          <w:rPr>
+            <w:rStyle w:val="Hyperlink"/>
+          </w:rPr>
+          <w:t xml:space="preserve">https://doi.org/10.1109/TAFFC.2014.2316163</w:t>
+        </w:r>
+      </w:hyperlink>
+      <w:r>
+        <w:t xml:space="preserve">.</w:t>
       </w:r>
     </w:p>
     <w:p>
@@ -22977,53 +24391,21 @@
         <w:t xml:space="preserve"> </w:t>
       </w:r>
       <w:r>
-        <w:t xml:space="preserve">In</w:t>
-      </w:r>
-      <w:r>
-        <w:t xml:space="preserve"> </w:t>
-      </w:r>
-      <w:r>
-        <w:rPr>
-          <w:i/>
-          <w:iCs/>
-        </w:rPr>
-        <w:t xml:space="preserve">Proceedings of the 7th International Learning Analytics &amp; Knowledge Conference (LAK)</w:t>
-      </w:r>
-      <w:r>
-        <w:t xml:space="preserve">; Vancouver, BC, Canada, 13–17 March 2017; pp. 218–227. doi:10.1145/3027385.3027400.</w:t>
-      </w:r>
-    </w:p>
-    <w:p>
-      <w:pPr>
-        <w:pStyle w:val="BodyText"/>
-      </w:pPr>
-      <w:r>
-        <w:t xml:space="preserve">Dillenbourg, P.; Zufferey, G.; Alavi, H.; Jermann, P.; Do-Lenh, S.; Bonnard, Q.; Cuendet, S.; Kaplan, F.</w:t>
-      </w:r>
-      <w:r>
-        <w:t xml:space="preserve"> </w:t>
-      </w:r>
-      <w:r>
-        <w:t xml:space="preserve">Classroom Orchestration: The Third Circle of Usability.</w:t>
-      </w:r>
-      <w:r>
-        <w:t xml:space="preserve"> </w:t>
-      </w:r>
-      <w:r>
-        <w:t xml:space="preserve">In</w:t>
-      </w:r>
-      <w:r>
-        <w:t xml:space="preserve"> </w:t>
-      </w:r>
-      <w:r>
-        <w:rPr>
-          <w:i/>
-          <w:iCs/>
-        </w:rPr>
-        <w:t xml:space="preserve">Connecting Computer-Supported Collaborative Learning to Policy and Practice: CSCL2011 Conference Proceedings</w:t>
-      </w:r>
-      <w:r>
-        <w:t xml:space="preserve">; ISLS, 2011; pp. 510–517.</w:t>
+        <w:t xml:space="preserve">In Proceedings of the 7th International Learning Analytics &amp; Knowledge Conference (LAK), Vancouver, BC, Canada, 13–17 March 2017; pp. 218–227.</w:t>
+      </w:r>
+      <w:r>
+        <w:t xml:space="preserve"> </w:t>
+      </w:r>
+      <w:hyperlink r:id="rId117">
+        <w:r>
+          <w:rPr>
+            <w:rStyle w:val="Hyperlink"/>
+          </w:rPr>
+          <w:t xml:space="preserve">https://doi.org/10.1145/3027385.3027400</w:t>
+        </w:r>
+      </w:hyperlink>
+      <w:r>
+        <w:t xml:space="preserve">.</w:t>
       </w:r>
     </w:p>
     <w:p>
@@ -23073,7 +24455,21 @@
         <w:t xml:space="preserve">58</w:t>
       </w:r>
       <w:r>
-        <w:t xml:space="preserve">, 63–86. doi:10.1177/0735633119825575.</w:t>
+        <w:t xml:space="preserve">, 63–86.</w:t>
+      </w:r>
+      <w:r>
+        <w:t xml:space="preserve"> </w:t>
+      </w:r>
+      <w:hyperlink r:id="rId118">
+        <w:r>
+          <w:rPr>
+            <w:rStyle w:val="Hyperlink"/>
+          </w:rPr>
+          <w:t xml:space="preserve">https://doi.org/10.1177/0735633119825575</w:t>
+        </w:r>
+      </w:hyperlink>
+      <w:r>
+        <w:t xml:space="preserve">.</w:t>
       </w:r>
     </w:p>
     <w:p>
@@ -23123,7 +24519,21 @@
         <w:t xml:space="preserve">13</w:t>
       </w:r>
       <w:r>
-        <w:t xml:space="preserve">, 903560. doi:10.3389/fpsyg.2022.903560.</w:t>
+        <w:t xml:space="preserve">, 903560.</w:t>
+      </w:r>
+      <w:r>
+        <w:t xml:space="preserve"> </w:t>
+      </w:r>
+      <w:hyperlink r:id="rId119">
+        <w:r>
+          <w:rPr>
+            <w:rStyle w:val="Hyperlink"/>
+          </w:rPr>
+          <w:t xml:space="preserve">https://doi.org/10.3389/fpsyg.2022.903560</w:t>
+        </w:r>
+      </w:hyperlink>
+      <w:r>
+        <w:t xml:space="preserve">.</w:t>
       </w:r>
     </w:p>
     <w:p>
@@ -23143,20 +24553,21 @@
         <w:t xml:space="preserve"> </w:t>
       </w:r>
       <w:r>
-        <w:t xml:space="preserve">In</w:t>
-      </w:r>
-      <w:r>
-        <w:t xml:space="preserve"> </w:t>
-      </w:r>
-      <w:r>
-        <w:rPr>
-          <w:i/>
-          <w:iCs/>
-        </w:rPr>
-        <w:t xml:space="preserve">Proceedings of the IEEE/CVF Conference on Computer Vision and Pattern Recognition (CVPR)</w:t>
-      </w:r>
-      <w:r>
-        <w:t xml:space="preserve">; Vancouver, BC, Canada, 18–22 June 2023; pp. 2818–2829. doi:10.1109/CVPR52729.2023.00276.</w:t>
+        <w:t xml:space="preserve">In Proceedings of the IEEE/CVF Conference on Computer Vision and Pattern Recognition (CVPR), Vancouver, BC, Canada, 18–22 June 2023; pp. 2818–2829.</w:t>
+      </w:r>
+      <w:r>
+        <w:t xml:space="preserve"> </w:t>
+      </w:r>
+      <w:hyperlink r:id="rId120">
+        <w:r>
+          <w:rPr>
+            <w:rStyle w:val="Hyperlink"/>
+          </w:rPr>
+          <w:t xml:space="preserve">https://doi.org/10.1109/CVPR52729.2023.00276</w:t>
+        </w:r>
+      </w:hyperlink>
+      <w:r>
+        <w:t xml:space="preserve">.</w:t>
       </w:r>
     </w:p>
     <w:p>
@@ -23176,20 +24587,21 @@
         <w:t xml:space="preserve"> </w:t>
       </w:r>
       <w:r>
-        <w:t xml:space="preserve">In</w:t>
-      </w:r>
-      <w:r>
-        <w:t xml:space="preserve"> </w:t>
-      </w:r>
-      <w:r>
-        <w:rPr>
-          <w:i/>
-          <w:iCs/>
-        </w:rPr>
-        <w:t xml:space="preserve">Proceedings of the IEEE/CVF International Conference on Computer Vision (ICCV)</w:t>
-      </w:r>
-      <w:r>
-        <w:t xml:space="preserve">; Paris, France, 2–6 October 2023; pp. 11975–11986. doi:10.1109/ICCV51070.2023.01100.</w:t>
+        <w:t xml:space="preserve">In Proceedings of the IEEE/CVF International Conference on Computer Vision (ICCV), Paris, France, 2–6 October 2023; pp. 11975–11986.</w:t>
+      </w:r>
+      <w:r>
+        <w:t xml:space="preserve"> </w:t>
+      </w:r>
+      <w:hyperlink r:id="rId121">
+        <w:r>
+          <w:rPr>
+            <w:rStyle w:val="Hyperlink"/>
+          </w:rPr>
+          <w:t xml:space="preserve">https://doi.org/10.1109/ICCV51070.2023.01100</w:t>
+        </w:r>
+      </w:hyperlink>
+      <w:r>
+        <w:t xml:space="preserve">.</w:t>
       </w:r>
     </w:p>
     <w:p>
@@ -23209,20 +24621,21 @@
         <w:t xml:space="preserve"> </w:t>
       </w:r>
       <w:r>
-        <w:t xml:space="preserve">In</w:t>
-      </w:r>
-      <w:r>
-        <w:t xml:space="preserve"> </w:t>
-      </w:r>
-      <w:r>
-        <w:rPr>
-          <w:i/>
-          <w:iCs/>
-        </w:rPr>
-        <w:t xml:space="preserve">Proceedings of the 2022 Conference on Empirical Methods in Natural Language Processing (EMNLP)</w:t>
-      </w:r>
-      <w:r>
-        <w:t xml:space="preserve">; Abu Dhabi, United Arab Emirates, 7–11 December 2022; pp. 3876–3887. doi:10.18653/v1/2022.emnlp-main.256.</w:t>
+        <w:t xml:space="preserve">In Proceedings of the 2022 Conference on Empirical Methods in Natural Language Processing (EMNLP), Abu Dhabi, United Arab Emirates, 7–11 December 2022; pp. 3876–3887.</w:t>
+      </w:r>
+      <w:r>
+        <w:t xml:space="preserve"> </w:t>
+      </w:r>
+      <w:hyperlink r:id="rId122">
+        <w:r>
+          <w:rPr>
+            <w:rStyle w:val="Hyperlink"/>
+          </w:rPr>
+          <w:t xml:space="preserve">https://doi.org/10.18653/v1/2022.emnlp-main.256</w:t>
+        </w:r>
+      </w:hyperlink>
+      <w:r>
+        <w:t xml:space="preserve">.</w:t>
       </w:r>
     </w:p>
     <w:p>
@@ -23272,7 +24685,21 @@
         <w:t xml:space="preserve">62</w:t>
       </w:r>
       <w:r>
-        <w:t xml:space="preserve">, 1–16. doi:10.1109/TGRS.2024.3390838.</w:t>
+        <w:t xml:space="preserve">, 1–16.</w:t>
+      </w:r>
+      <w:r>
+        <w:t xml:space="preserve"> </w:t>
+      </w:r>
+      <w:hyperlink r:id="rId123">
+        <w:r>
+          <w:rPr>
+            <w:rStyle w:val="Hyperlink"/>
+          </w:rPr>
+          <w:t xml:space="preserve">https://doi.org/10.1109/TGRS.2024.3390838</w:t>
+        </w:r>
+      </w:hyperlink>
+      <w:r>
+        <w:t xml:space="preserve">.</w:t>
       </w:r>
     </w:p>
     <w:p>
@@ -23359,7 +24786,21 @@
         <w:t xml:space="preserve">130</w:t>
       </w:r>
       <w:r>
-        <w:t xml:space="preserve">, 2337–2348. doi:10.1007/s11263-022-01653-1.</w:t>
+        <w:t xml:space="preserve">, 2337–2348.</w:t>
+      </w:r>
+      <w:r>
+        <w:t xml:space="preserve"> </w:t>
+      </w:r>
+      <w:hyperlink r:id="rId124">
+        <w:r>
+          <w:rPr>
+            <w:rStyle w:val="Hyperlink"/>
+          </w:rPr>
+          <w:t xml:space="preserve">https://doi.org/10.1007/s11263-022-01653-1</w:t>
+        </w:r>
+      </w:hyperlink>
+      <w:r>
+        <w:t xml:space="preserve">.</w:t>
       </w:r>
     </w:p>
     <w:p>
@@ -23379,20 +24820,21 @@
         <w:t xml:space="preserve"> </w:t>
       </w:r>
       <w:r>
-        <w:t xml:space="preserve">In</w:t>
-      </w:r>
-      <w:r>
-        <w:t xml:space="preserve"> </w:t>
-      </w:r>
-      <w:r>
-        <w:rPr>
-          <w:i/>
-          <w:iCs/>
-        </w:rPr>
-        <w:t xml:space="preserve">Proceedings of the IEEE/CVF Conference on Computer Vision and Pattern Recognition (CVPR)</w:t>
-      </w:r>
-      <w:r>
-        <w:t xml:space="preserve">; New Orleans, LA, USA, 18–24 June 2022; pp. 16816–16825. doi:10.1109/CVPR52688.2022.01631.</w:t>
+        <w:t xml:space="preserve">In Proceedings of the IEEE/CVF Conference on Computer Vision and Pattern Recognition (CVPR), New Orleans, LA, USA, 18–24 June 2022; pp. 16816–16825.</w:t>
+      </w:r>
+      <w:r>
+        <w:t xml:space="preserve"> </w:t>
+      </w:r>
+      <w:hyperlink r:id="rId125">
+        <w:r>
+          <w:rPr>
+            <w:rStyle w:val="Hyperlink"/>
+          </w:rPr>
+          <w:t xml:space="preserve">https://doi.org/10.1109/CVPR52688.2022.01631</w:t>
+        </w:r>
+      </w:hyperlink>
+      <w:r>
+        <w:t xml:space="preserve">.</w:t>
       </w:r>
     </w:p>
     <w:p>
@@ -23412,20 +24854,21 @@
         <w:t xml:space="preserve"> </w:t>
       </w:r>
       <w:r>
-        <w:t xml:space="preserve">In</w:t>
-      </w:r>
-      <w:r>
-        <w:t xml:space="preserve"> </w:t>
-      </w:r>
-      <w:r>
-        <w:rPr>
-          <w:i/>
-          <w:iCs/>
-        </w:rPr>
-        <w:t xml:space="preserve">Proceedings of the IEEE/CVF International Conference on Computer Vision (ICCV)</w:t>
-      </w:r>
-      <w:r>
-        <w:t xml:space="preserve">; Paris, France, 2–6 October 2023; pp. 15645–15655. doi:10.1109/ICCV51070.2023.01438.</w:t>
+        <w:t xml:space="preserve">In Proceedings of the IEEE/CVF International Conference on Computer Vision (ICCV), Paris, France, 2–6 October 2023; pp. 15645–15655.</w:t>
+      </w:r>
+      <w:r>
+        <w:t xml:space="preserve"> </w:t>
+      </w:r>
+      <w:hyperlink r:id="rId126">
+        <w:r>
+          <w:rPr>
+            <w:rStyle w:val="Hyperlink"/>
+          </w:rPr>
+          <w:t xml:space="preserve">https://doi.org/10.1109/ICCV51070.2023.01438</w:t>
+        </w:r>
+      </w:hyperlink>
+      <w:r>
+        <w:t xml:space="preserve">.</w:t>
       </w:r>
     </w:p>
     <w:p>
@@ -23445,20 +24888,21 @@
         <w:t xml:space="preserve"> </w:t>
       </w:r>
       <w:r>
-        <w:t xml:space="preserve">In</w:t>
-      </w:r>
-      <w:r>
-        <w:t xml:space="preserve"> </w:t>
-      </w:r>
-      <w:r>
-        <w:rPr>
-          <w:i/>
-          <w:iCs/>
-        </w:rPr>
-        <w:t xml:space="preserve">Proceedings of the IEEE/CVF International Conference on Computer Vision (ICCV)</w:t>
-      </w:r>
-      <w:r>
-        <w:t xml:space="preserve">; Paris, France, 2–6 October 2023; pp. 15700–15711. doi:10.1109/ICCV51070.2023.01443.</w:t>
+        <w:t xml:space="preserve">In Proceedings of the IEEE/CVF International Conference on Computer Vision (ICCV), Paris, France, 2–6 October 2023; pp. 15700–15711.</w:t>
+      </w:r>
+      <w:r>
+        <w:t xml:space="preserve"> </w:t>
+      </w:r>
+      <w:hyperlink r:id="rId127">
+        <w:r>
+          <w:rPr>
+            <w:rStyle w:val="Hyperlink"/>
+          </w:rPr>
+          <w:t xml:space="preserve">https://doi.org/10.1109/ICCV51070.2023.01443</w:t>
+        </w:r>
+      </w:hyperlink>
+      <w:r>
+        <w:t xml:space="preserve">.</w:t>
       </w:r>
     </w:p>
     <w:p>
@@ -23492,8 +24936,8 @@
         <w:t xml:space="preserve">(accessed on 27 April 2026).</w:t>
       </w:r>
     </w:p>
-    <w:bookmarkEnd w:id="116"/>
-    <w:bookmarkEnd w:id="117"/>
+    <w:bookmarkEnd w:id="128"/>
+    <w:bookmarkEnd w:id="129"/>
     <w:sectPr>
       <w:footnotePr>
         <w:numRestart w:val="eachSect"/>

</xml_diff>